<commit_message>
Clean up segmentation report and Quarto formatting
</commit_message>
<xml_diff>
--- a/Group4-DAMO-520-20.docx
+++ b/Group4-DAMO-520-20.docx
@@ -291,6 +291,26 @@
           <w:rtl w:val="0"/>
         </w:rPr>
         <w:t xml:space="preserve">Term 1</w:t>
+      </w:r>
+    </w:p>
+    <w:p>
+      <w:pPr>
+        <w:spacing w:after="120" w:line="480" w:lineRule="auto"/>
+        <w:jc w:val="center"/>
+        <w:rPr>
+          <w:rFonts w:ascii="Times New Roman" w:cs="Times New Roman" w:eastAsia="Times New Roman" w:hAnsi="Times New Roman"/>
+          <w:sz w:val="24"/>
+          <w:szCs w:val="24"/>
+        </w:rPr>
+      </w:pPr>
+      <w:r>
+        <w:rPr>
+          <w:rFonts w:ascii="Times New Roman" w:cs="Times New Roman" w:eastAsia="Times New Roman" w:hAnsi="Times New Roman"/>
+          <w:sz w:val="24"/>
+          <w:szCs w:val="24"/>
+          <w:rtl w:val="0"/>
+        </w:rPr>
+        <w:t xml:space="preserve">Term 2</w:t>
       </w:r>
     </w:p>
     <w:p>
@@ -1577,23 +1597,6 @@
     </w:p>
     <w:p>
       <w:pPr>
-        <w:spacing w:line="480" w:lineRule="auto"/>
-        <w:ind w:left="0" w:firstLine="0"/>
-        <w:jc w:val="center"/>
-        <w:rPr>
-          <w:rFonts w:ascii="Times New Roman" w:cs="Times New Roman" w:eastAsia="Times New Roman" w:hAnsi="Times New Roman"/>
-          <w:sz w:val="24"/>
-          <w:szCs w:val="24"/>
-        </w:rPr>
-      </w:pPr>
-      <w:r>
-        <w:rPr>
-          <w:rtl w:val="0"/>
-        </w:rPr>
-      </w:r>
-    </w:p>
-    <w:p>
-      <w:pPr>
         <w:pStyle w:val="Heading1"/>
         <w:spacing w:line="480" w:lineRule="auto"/>
         <w:jc w:val="center"/>
@@ -1672,22 +1675,6 @@
     </w:p>
     <w:p>
       <w:pPr>
-        <w:spacing w:line="480" w:lineRule="auto"/>
-        <w:ind w:left="0" w:firstLine="720"/>
-        <w:rPr>
-          <w:rFonts w:ascii="Times New Roman" w:cs="Times New Roman" w:eastAsia="Times New Roman" w:hAnsi="Times New Roman"/>
-          <w:sz w:val="24"/>
-          <w:szCs w:val="24"/>
-        </w:rPr>
-      </w:pPr>
-      <w:r>
-        <w:rPr>
-          <w:rtl w:val="0"/>
-        </w:rPr>
-      </w:r>
-    </w:p>
-    <w:p>
-      <w:pPr>
         <w:pStyle w:val="Heading1"/>
         <w:spacing w:line="480" w:lineRule="auto"/>
         <w:jc w:val="center"/>
@@ -1704,16 +1691,6 @@
     </w:p>
     <w:p>
       <w:pPr>
-        <w:rPr/>
-      </w:pPr>
-      <w:r>
-        <w:rPr>
-          <w:rtl w:val="0"/>
-        </w:rPr>
-      </w:r>
-    </w:p>
-    <w:p>
-      <w:pPr>
         <w:spacing w:after="240" w:before="240" w:line="480" w:lineRule="auto"/>
         <w:ind w:firstLine="720"/>
         <w:rPr>
@@ -1820,12 +1797,12 @@
           <wp:inline distB="114300" distT="114300" distL="114300" distR="114300">
             <wp:extent cx="5943600" cy="3975100"/>
             <wp:effectExtent b="0" l="0" r="0" t="0"/>
-            <wp:docPr id="1" name="image6.png"/>
+            <wp:docPr id="1" name="image13.png"/>
             <a:graphic>
               <a:graphicData uri="http://schemas.openxmlformats.org/drawingml/2006/picture">
                 <pic:pic>
                   <pic:nvPicPr>
-                    <pic:cNvPr id="0" name="image6.png"/>
+                    <pic:cNvPr id="0" name="image13.png"/>
                     <pic:cNvPicPr preferRelativeResize="0"/>
                   </pic:nvPicPr>
                   <pic:blipFill>
@@ -1858,102 +1835,6 @@
     <w:p>
       <w:pPr>
         <w:spacing w:after="240" w:before="240" w:line="480" w:lineRule="auto"/>
-        <w:ind w:firstLine="720"/>
-        <w:rPr>
-          <w:rFonts w:ascii="Times New Roman" w:cs="Times New Roman" w:eastAsia="Times New Roman" w:hAnsi="Times New Roman"/>
-          <w:sz w:val="24"/>
-          <w:szCs w:val="24"/>
-        </w:rPr>
-      </w:pPr>
-      <w:r>
-        <w:rPr>
-          <w:rtl w:val="0"/>
-        </w:rPr>
-      </w:r>
-    </w:p>
-    <w:p>
-      <w:pPr>
-        <w:spacing w:after="240" w:before="240" w:line="480" w:lineRule="auto"/>
-        <w:ind w:firstLine="720"/>
-        <w:rPr>
-          <w:rFonts w:ascii="Times New Roman" w:cs="Times New Roman" w:eastAsia="Times New Roman" w:hAnsi="Times New Roman"/>
-          <w:sz w:val="24"/>
-          <w:szCs w:val="24"/>
-        </w:rPr>
-      </w:pPr>
-      <w:r>
-        <w:rPr>
-          <w:rtl w:val="0"/>
-        </w:rPr>
-      </w:r>
-    </w:p>
-    <w:p>
-      <w:pPr>
-        <w:spacing w:after="240" w:before="240" w:line="480" w:lineRule="auto"/>
-        <w:ind w:firstLine="720"/>
-        <w:rPr>
-          <w:rFonts w:ascii="Times New Roman" w:cs="Times New Roman" w:eastAsia="Times New Roman" w:hAnsi="Times New Roman"/>
-          <w:sz w:val="24"/>
-          <w:szCs w:val="24"/>
-        </w:rPr>
-      </w:pPr>
-      <w:r>
-        <w:rPr>
-          <w:rtl w:val="0"/>
-        </w:rPr>
-      </w:r>
-    </w:p>
-    <w:p>
-      <w:pPr>
-        <w:spacing w:after="240" w:before="240" w:line="480" w:lineRule="auto"/>
-        <w:ind w:firstLine="720"/>
-        <w:rPr>
-          <w:rFonts w:ascii="Times New Roman" w:cs="Times New Roman" w:eastAsia="Times New Roman" w:hAnsi="Times New Roman"/>
-          <w:sz w:val="24"/>
-          <w:szCs w:val="24"/>
-        </w:rPr>
-      </w:pPr>
-      <w:r>
-        <w:rPr>
-          <w:rtl w:val="0"/>
-        </w:rPr>
-      </w:r>
-    </w:p>
-    <w:p>
-      <w:pPr>
-        <w:spacing w:after="240" w:before="240" w:line="480" w:lineRule="auto"/>
-        <w:ind w:firstLine="720"/>
-        <w:rPr>
-          <w:rFonts w:ascii="Times New Roman" w:cs="Times New Roman" w:eastAsia="Times New Roman" w:hAnsi="Times New Roman"/>
-          <w:sz w:val="24"/>
-          <w:szCs w:val="24"/>
-        </w:rPr>
-      </w:pPr>
-      <w:r>
-        <w:rPr>
-          <w:rtl w:val="0"/>
-        </w:rPr>
-      </w:r>
-    </w:p>
-    <w:p>
-      <w:pPr>
-        <w:spacing w:after="240" w:before="240" w:line="480" w:lineRule="auto"/>
-        <w:ind w:firstLine="720"/>
-        <w:rPr>
-          <w:rFonts w:ascii="Times New Roman" w:cs="Times New Roman" w:eastAsia="Times New Roman" w:hAnsi="Times New Roman"/>
-          <w:sz w:val="24"/>
-          <w:szCs w:val="24"/>
-        </w:rPr>
-      </w:pPr>
-      <w:r>
-        <w:rPr>
-          <w:rtl w:val="0"/>
-        </w:rPr>
-      </w:r>
-    </w:p>
-    <w:p>
-      <w:pPr>
-        <w:spacing w:after="240" w:before="240" w:line="480" w:lineRule="auto"/>
         <w:ind w:left="0" w:firstLine="720"/>
         <w:rPr>
           <w:rFonts w:ascii="Times New Roman" w:cs="Times New Roman" w:eastAsia="Times New Roman" w:hAnsi="Times New Roman"/>
@@ -2011,12 +1892,12 @@
           <wp:inline distB="114300" distT="114300" distL="114300" distR="114300">
             <wp:extent cx="5943600" cy="6019800"/>
             <wp:effectExtent b="0" l="0" r="0" t="0"/>
-            <wp:docPr id="19" name="image15.png"/>
+            <wp:docPr id="19" name="image18.png"/>
             <a:graphic>
               <a:graphicData uri="http://schemas.openxmlformats.org/drawingml/2006/picture">
                 <pic:pic>
                   <pic:nvPicPr>
-                    <pic:cNvPr id="0" name="image15.png"/>
+                    <pic:cNvPr id="0" name="image18.png"/>
                     <pic:cNvPicPr preferRelativeResize="0"/>
                   </pic:nvPicPr>
                   <pic:blipFill>
@@ -2066,12 +1947,12 @@
           <wp:inline distB="114300" distT="114300" distL="114300" distR="114300">
             <wp:extent cx="5943600" cy="6159500"/>
             <wp:effectExtent b="0" l="0" r="0" t="0"/>
-            <wp:docPr id="9" name="image3.png"/>
+            <wp:docPr id="9" name="image6.png"/>
             <a:graphic>
               <a:graphicData uri="http://schemas.openxmlformats.org/drawingml/2006/picture">
                 <pic:pic>
                   <pic:nvPicPr>
-                    <pic:cNvPr id="0" name="image3.png"/>
+                    <pic:cNvPr id="0" name="image6.png"/>
                     <pic:cNvPicPr preferRelativeResize="0"/>
                   </pic:nvPicPr>
                   <pic:blipFill>
@@ -2205,12 +2086,12 @@
           <wp:inline distB="114300" distT="114300" distL="114300" distR="114300">
             <wp:extent cx="5943600" cy="1879600"/>
             <wp:effectExtent b="0" l="0" r="0" t="0"/>
-            <wp:docPr id="16" name="image8.png"/>
+            <wp:docPr id="16" name="image10.png"/>
             <a:graphic>
               <a:graphicData uri="http://schemas.openxmlformats.org/drawingml/2006/picture">
                 <pic:pic>
                   <pic:nvPicPr>
-                    <pic:cNvPr id="0" name="image8.png"/>
+                    <pic:cNvPr id="0" name="image10.png"/>
                     <pic:cNvPicPr preferRelativeResize="0"/>
                   </pic:nvPicPr>
                   <pic:blipFill>
@@ -2317,12 +2198,12 @@
           <wp:inline distB="114300" distT="114300" distL="114300" distR="114300">
             <wp:extent cx="4529138" cy="3952875"/>
             <wp:effectExtent b="0" l="0" r="0" t="0"/>
-            <wp:docPr id="8" name="image16.png"/>
+            <wp:docPr id="8" name="image1.png"/>
             <a:graphic>
               <a:graphicData uri="http://schemas.openxmlformats.org/drawingml/2006/picture">
                 <pic:pic>
                   <pic:nvPicPr>
-                    <pic:cNvPr id="0" name="image16.png"/>
+                    <pic:cNvPr id="0" name="image1.png"/>
                     <pic:cNvPicPr preferRelativeResize="0"/>
                   </pic:nvPicPr>
                   <pic:blipFill>
@@ -2428,12 +2309,12 @@
           <wp:inline distB="114300" distT="114300" distL="114300" distR="114300">
             <wp:extent cx="5943600" cy="5740400"/>
             <wp:effectExtent b="0" l="0" r="0" t="0"/>
-            <wp:docPr id="13" name="image14.png"/>
+            <wp:docPr id="13" name="image16.png"/>
             <a:graphic>
               <a:graphicData uri="http://schemas.openxmlformats.org/drawingml/2006/picture">
                 <pic:pic>
                   <pic:nvPicPr>
-                    <pic:cNvPr id="0" name="image14.png"/>
+                    <pic:cNvPr id="0" name="image16.png"/>
                     <pic:cNvPicPr preferRelativeResize="0"/>
                   </pic:nvPicPr>
                   <pic:blipFill>
@@ -2487,6 +2368,7 @@
       <w:pPr>
         <w:spacing w:after="240" w:before="240" w:line="480" w:lineRule="auto"/>
         <w:ind w:firstLine="720"/>
+        <w:jc w:val="center"/>
         <w:rPr>
           <w:rFonts w:ascii="Times New Roman" w:cs="Times New Roman" w:eastAsia="Times New Roman" w:hAnsi="Times New Roman"/>
           <w:sz w:val="24"/>
@@ -2512,12 +2394,12 @@
           <wp:inline distB="114300" distT="114300" distL="114300" distR="114300">
             <wp:extent cx="5233988" cy="6181725"/>
             <wp:effectExtent b="0" l="0" r="0" t="0"/>
-            <wp:docPr id="4" name="image9.png"/>
+            <wp:docPr id="4" name="image7.png"/>
             <a:graphic>
               <a:graphicData uri="http://schemas.openxmlformats.org/drawingml/2006/picture">
                 <pic:pic>
                   <pic:nvPicPr>
-                    <pic:cNvPr id="0" name="image9.png"/>
+                    <pic:cNvPr id="0" name="image7.png"/>
                     <pic:cNvPicPr preferRelativeResize="0"/>
                   </pic:nvPicPr>
                   <pic:blipFill>
@@ -2606,70 +2488,6 @@
     <w:p>
       <w:pPr>
         <w:spacing w:after="240" w:before="240" w:line="480" w:lineRule="auto"/>
-        <w:ind w:firstLine="720"/>
-        <w:rPr>
-          <w:rFonts w:ascii="Times New Roman" w:cs="Times New Roman" w:eastAsia="Times New Roman" w:hAnsi="Times New Roman"/>
-          <w:sz w:val="24"/>
-          <w:szCs w:val="24"/>
-        </w:rPr>
-      </w:pPr>
-      <w:r>
-        <w:rPr>
-          <w:rtl w:val="0"/>
-        </w:rPr>
-      </w:r>
-    </w:p>
-    <w:p>
-      <w:pPr>
-        <w:spacing w:after="240" w:before="240" w:line="480" w:lineRule="auto"/>
-        <w:ind w:left="0" w:firstLine="720"/>
-        <w:rPr>
-          <w:rFonts w:ascii="Times New Roman" w:cs="Times New Roman" w:eastAsia="Times New Roman" w:hAnsi="Times New Roman"/>
-          <w:sz w:val="24"/>
-          <w:szCs w:val="24"/>
-        </w:rPr>
-      </w:pPr>
-      <w:r>
-        <w:rPr>
-          <w:rtl w:val="0"/>
-        </w:rPr>
-      </w:r>
-    </w:p>
-    <w:p>
-      <w:pPr>
-        <w:spacing w:after="240" w:before="240" w:line="480" w:lineRule="auto"/>
-        <w:ind w:left="0" w:firstLine="720"/>
-        <w:rPr>
-          <w:rFonts w:ascii="Times New Roman" w:cs="Times New Roman" w:eastAsia="Times New Roman" w:hAnsi="Times New Roman"/>
-          <w:sz w:val="24"/>
-          <w:szCs w:val="24"/>
-        </w:rPr>
-      </w:pPr>
-      <w:r>
-        <w:rPr>
-          <w:rtl w:val="0"/>
-        </w:rPr>
-      </w:r>
-    </w:p>
-    <w:p>
-      <w:pPr>
-        <w:spacing w:after="240" w:before="240" w:line="480" w:lineRule="auto"/>
-        <w:ind w:firstLine="720"/>
-        <w:rPr>
-          <w:rFonts w:ascii="Times New Roman" w:cs="Times New Roman" w:eastAsia="Times New Roman" w:hAnsi="Times New Roman"/>
-          <w:sz w:val="24"/>
-          <w:szCs w:val="24"/>
-        </w:rPr>
-      </w:pPr>
-      <w:r>
-        <w:rPr>
-          <w:rtl w:val="0"/>
-        </w:rPr>
-      </w:r>
-    </w:p>
-    <w:p>
-      <w:pPr>
-        <w:spacing w:line="480" w:lineRule="auto"/>
         <w:ind w:left="0" w:firstLine="0"/>
         <w:rPr>
           <w:rFonts w:ascii="Times New Roman" w:cs="Times New Roman" w:eastAsia="Times New Roman" w:hAnsi="Times New Roman"/>
@@ -2686,84 +2504,17 @@
     <w:p>
       <w:pPr>
         <w:spacing w:after="240" w:before="240" w:line="480" w:lineRule="auto"/>
-        <w:ind w:firstLine="720"/>
-        <w:rPr>
-          <w:rFonts w:ascii="Times New Roman" w:cs="Times New Roman" w:eastAsia="Times New Roman" w:hAnsi="Times New Roman"/>
-          <w:sz w:val="24"/>
-          <w:szCs w:val="24"/>
-        </w:rPr>
-      </w:pPr>
-      <w:r>
-        <w:rPr>
-          <w:rFonts w:ascii="Times New Roman" w:cs="Times New Roman" w:eastAsia="Times New Roman" w:hAnsi="Times New Roman"/>
-          <w:sz w:val="24"/>
-          <w:szCs w:val="24"/>
-          <w:rtl w:val="0"/>
-        </w:rPr>
-        <w:t xml:space="preserve">. Animals are caught when they put their head (or a leg) into the snare and pull it tight as they keep moving (Noss, 1998). In some cases, wildlife is chased in the direction of snare lines by illegal hunters (sometimes using perimeter fencing around reserves to assist in funnelling wildlife.  </w:t>
-      </w:r>
-      <w:r>
-        <w:rPr>
-          <w:rFonts w:ascii="Times New Roman" w:cs="Times New Roman" w:eastAsia="Times New Roman" w:hAnsi="Times New Roman"/>
-          <w:sz w:val="24"/>
-          <w:szCs w:val="24"/>
-          <w:rtl w:val="0"/>
-        </w:rPr>
-        <w:t xml:space="preserve">Because of the low value of snares, illegal hunters often check them infrequently, resulting in a high degree of wastage when animals are killed and rot without being retrieved (Noss, 1998). A study estimates that over 100,000 African elephants were killed by poachers across the continent between 2010 and 2012, largely driven by illegal hunting for ivory (Wittemyer et al., 2014).</w:t>
-      </w:r>
-    </w:p>
-    <w:p>
-      <w:pPr>
-        <w:spacing w:after="240" w:before="240" w:line="480" w:lineRule="auto"/>
-        <w:ind w:firstLine="720"/>
-        <w:rPr>
-          <w:rFonts w:ascii="Times New Roman" w:cs="Times New Roman" w:eastAsia="Times New Roman" w:hAnsi="Times New Roman"/>
-          <w:sz w:val="24"/>
-          <w:szCs w:val="24"/>
-        </w:rPr>
-      </w:pPr>
-      <w:r>
-        <w:rPr>
-          <w:rtl w:val="0"/>
-        </w:rPr>
-      </w:r>
-    </w:p>
-    <w:p>
-      <w:pPr>
-        <w:spacing w:after="240" w:before="240" w:line="480" w:lineRule="auto"/>
-        <w:ind w:firstLine="720"/>
-        <w:rPr>
-          <w:rFonts w:ascii="Times New Roman" w:cs="Times New Roman" w:eastAsia="Times New Roman" w:hAnsi="Times New Roman"/>
-          <w:sz w:val="24"/>
-          <w:szCs w:val="24"/>
-        </w:rPr>
-      </w:pPr>
-      <w:r>
-        <w:rPr>
-          <w:rFonts w:ascii="Times New Roman" w:cs="Times New Roman" w:eastAsia="Times New Roman" w:hAnsi="Times New Roman"/>
-          <w:sz w:val="24"/>
-          <w:szCs w:val="24"/>
-          <w:rtl w:val="0"/>
-        </w:rPr>
-        <w:t xml:space="preserve">Poisoning by cyanobacteria, hemorrhagic septicemia, and neurological problems and syndromes such as “floppy trunk” cause an avalanche of elephant deaths.  </w:t>
-      </w:r>
-      <w:r>
-        <w:rPr>
-          <w:rFonts w:ascii="Times New Roman" w:cs="Times New Roman" w:eastAsia="Times New Roman" w:hAnsi="Times New Roman"/>
-          <w:sz w:val="24"/>
-          <w:szCs w:val="24"/>
-          <w:rtl w:val="0"/>
-        </w:rPr>
-        <w:t xml:space="preserve">In 2020, approximately 350 African elephants died after drinking water contaminated with toxic cyanobacteria, likely linked to environmental changes (Lomeo et al., 2024). Additionally, bacterial infections such as hemorrhagic septicemia have been identified as causes of elephant deaths in Zimbabwe (AP News, 2020). Conditions such as floppy trunk syndrome, which impairs feeding and leads to starvation, have also been documented among free-ranging elephants (Fowler, 2006). </w:t>
-      </w:r>
-      <w:r>
-        <w:rPr>
-          <w:rFonts w:ascii="Times New Roman" w:cs="Times New Roman" w:eastAsia="Times New Roman" w:hAnsi="Times New Roman"/>
-          <w:sz w:val="24"/>
-          <w:szCs w:val="24"/>
-          <w:rtl w:val="0"/>
-        </w:rPr>
-        <w:t xml:space="preserve">Unfortunately, governments and NGOs  do not have programs or provide sufficient resources to protect elephants from these diseases, which results in the mass death of these animals, despite the existence of national wildlife parks.</w:t>
+        <w:ind w:left="0" w:firstLine="0"/>
+        <w:rPr>
+          <w:rFonts w:ascii="Times New Roman" w:cs="Times New Roman" w:eastAsia="Times New Roman" w:hAnsi="Times New Roman"/>
+          <w:sz w:val="24"/>
+          <w:szCs w:val="24"/>
+        </w:rPr>
+      </w:pPr>
+      <w:r>
+        <w:rPr>
+          <w:rtl w:val="0"/>
+        </w:rPr>
       </w:r>
     </w:p>
     <w:p>
@@ -3068,14 +2819,14 @@
         </w:rPr>
         <w:drawing>
           <wp:inline distB="114300" distT="114300" distL="114300" distR="114300">
-            <wp:extent cx="5943600" cy="2138363"/>
+            <wp:extent cx="5718682" cy="2062163"/>
             <wp:effectExtent b="0" l="0" r="0" t="0"/>
-            <wp:docPr id="6" name="image1.png"/>
+            <wp:docPr id="6" name="image11.png"/>
             <a:graphic>
               <a:graphicData uri="http://schemas.openxmlformats.org/drawingml/2006/picture">
                 <pic:pic>
                   <pic:nvPicPr>
-                    <pic:cNvPr id="0" name="image1.png"/>
+                    <pic:cNvPr id="0" name="image11.png"/>
                     <pic:cNvPicPr preferRelativeResize="0"/>
                   </pic:nvPicPr>
                   <pic:blipFill>
@@ -3088,7 +2839,7 @@
                   <pic:spPr>
                     <a:xfrm>
                       <a:off x="0" y="0"/>
-                      <a:ext cx="5943600" cy="2138363"/>
+                      <a:ext cx="5718682" cy="2062163"/>
                     </a:xfrm>
                     <a:prstGeom prst="rect"/>
                     <a:ln/>
@@ -3126,12 +2877,12 @@
           <wp:inline distB="114300" distT="114300" distL="114300" distR="114300">
             <wp:extent cx="5943600" cy="2641600"/>
             <wp:effectExtent b="0" l="0" r="0" t="0"/>
-            <wp:docPr id="18" name="image18.png"/>
+            <wp:docPr id="18" name="image15.png"/>
             <a:graphic>
               <a:graphicData uri="http://schemas.openxmlformats.org/drawingml/2006/picture">
                 <pic:pic>
                   <pic:nvPicPr>
-                    <pic:cNvPr id="0" name="image18.png"/>
+                    <pic:cNvPr id="0" name="image15.png"/>
                     <pic:cNvPicPr preferRelativeResize="0"/>
                   </pic:nvPicPr>
                   <pic:blipFill>
@@ -3181,12 +2932,12 @@
           <wp:inline distB="114300" distT="114300" distL="114300" distR="114300">
             <wp:extent cx="5943600" cy="1854200"/>
             <wp:effectExtent b="0" l="0" r="0" t="0"/>
-            <wp:docPr id="12" name="image19.png"/>
+            <wp:docPr id="12" name="image17.png"/>
             <a:graphic>
               <a:graphicData uri="http://schemas.openxmlformats.org/drawingml/2006/picture">
                 <pic:pic>
                   <pic:nvPicPr>
-                    <pic:cNvPr id="0" name="image19.png"/>
+                    <pic:cNvPr id="0" name="image17.png"/>
                     <pic:cNvPicPr preferRelativeResize="0"/>
                   </pic:nvPicPr>
                   <pic:blipFill>
@@ -3239,7 +2990,7 @@
     <w:p>
       <w:pPr>
         <w:spacing w:after="240" w:before="240" w:line="480" w:lineRule="auto"/>
-        <w:jc w:val="left"/>
+        <w:jc w:val="center"/>
         <w:rPr>
           <w:rFonts w:ascii="Times New Roman" w:cs="Times New Roman" w:eastAsia="Times New Roman" w:hAnsi="Times New Roman"/>
           <w:sz w:val="24"/>
@@ -3254,14 +3005,14 @@
         </w:rPr>
         <w:drawing>
           <wp:inline distB="114300" distT="114300" distL="114300" distR="114300">
-            <wp:extent cx="5943600" cy="6045200"/>
+            <wp:extent cx="5607008" cy="5698927"/>
             <wp:effectExtent b="0" l="0" r="0" t="0"/>
-            <wp:docPr id="14" name="image7.png"/>
+            <wp:docPr id="14" name="image12.png"/>
             <a:graphic>
               <a:graphicData uri="http://schemas.openxmlformats.org/drawingml/2006/picture">
                 <pic:pic>
                   <pic:nvPicPr>
-                    <pic:cNvPr id="0" name="image7.png"/>
+                    <pic:cNvPr id="0" name="image12.png"/>
                     <pic:cNvPicPr preferRelativeResize="0"/>
                   </pic:nvPicPr>
                   <pic:blipFill>
@@ -3274,7 +3025,7 @@
                   <pic:spPr>
                     <a:xfrm>
                       <a:off x="0" y="0"/>
-                      <a:ext cx="5943600" cy="6045200"/>
+                      <a:ext cx="5607008" cy="5698927"/>
                     </a:xfrm>
                     <a:prstGeom prst="rect"/>
                     <a:ln/>
@@ -3333,12 +3084,12 @@
           <wp:inline distB="114300" distT="114300" distL="114300" distR="114300">
             <wp:extent cx="5943600" cy="1308100"/>
             <wp:effectExtent b="0" l="0" r="0" t="0"/>
-            <wp:docPr id="7" name="image5.png"/>
+            <wp:docPr id="7" name="image8.png"/>
             <a:graphic>
               <a:graphicData uri="http://schemas.openxmlformats.org/drawingml/2006/picture">
                 <pic:pic>
                   <pic:nvPicPr>
-                    <pic:cNvPr id="0" name="image5.png"/>
+                    <pic:cNvPr id="0" name="image8.png"/>
                     <pic:cNvPicPr preferRelativeResize="0"/>
                   </pic:nvPicPr>
                   <pic:blipFill>
@@ -3387,12 +3138,12 @@
           <wp:inline distB="114300" distT="114300" distL="114300" distR="114300">
             <wp:extent cx="5943600" cy="1155700"/>
             <wp:effectExtent b="0" l="0" r="0" t="0"/>
-            <wp:docPr id="2" name="image12.png"/>
+            <wp:docPr id="2" name="image2.png"/>
             <a:graphic>
               <a:graphicData uri="http://schemas.openxmlformats.org/drawingml/2006/picture">
                 <pic:pic>
                   <pic:nvPicPr>
-                    <pic:cNvPr id="0" name="image12.png"/>
+                    <pic:cNvPr id="0" name="image2.png"/>
                     <pic:cNvPicPr preferRelativeResize="0"/>
                   </pic:nvPicPr>
                   <pic:blipFill>
@@ -3441,12 +3192,12 @@
           <wp:inline distB="114300" distT="114300" distL="114300" distR="114300">
             <wp:extent cx="5943600" cy="1054100"/>
             <wp:effectExtent b="0" l="0" r="0" t="0"/>
-            <wp:docPr id="10" name="image4.png"/>
+            <wp:docPr id="10" name="image3.png"/>
             <a:graphic>
               <a:graphicData uri="http://schemas.openxmlformats.org/drawingml/2006/picture">
                 <pic:pic>
                   <pic:nvPicPr>
-                    <pic:cNvPr id="0" name="image4.png"/>
+                    <pic:cNvPr id="0" name="image3.png"/>
                     <pic:cNvPicPr preferRelativeResize="0"/>
                   </pic:nvPicPr>
                   <pic:blipFill>
@@ -4002,12 +3753,12 @@
           <wp:inline distB="114300" distT="114300" distL="114300" distR="114300">
             <wp:extent cx="5943600" cy="3797300"/>
             <wp:effectExtent b="0" l="0" r="0" t="0"/>
-            <wp:docPr id="3" name="image17.png"/>
+            <wp:docPr id="3" name="image5.png"/>
             <a:graphic>
               <a:graphicData uri="http://schemas.openxmlformats.org/drawingml/2006/picture">
                 <pic:pic>
                   <pic:nvPicPr>
-                    <pic:cNvPr id="0" name="image17.png"/>
+                    <pic:cNvPr id="0" name="image5.png"/>
                     <pic:cNvPicPr preferRelativeResize="0"/>
                   </pic:nvPicPr>
                   <pic:blipFill>
@@ -4107,12 +3858,12 @@
           <wp:inline distB="114300" distT="114300" distL="114300" distR="114300">
             <wp:extent cx="5943600" cy="856506"/>
             <wp:effectExtent b="0" l="0" r="0" t="0"/>
-            <wp:docPr id="5" name="image11.png"/>
+            <wp:docPr id="5" name="image9.png"/>
             <a:graphic>
               <a:graphicData uri="http://schemas.openxmlformats.org/drawingml/2006/picture">
                 <pic:pic>
                   <pic:nvPicPr>
-                    <pic:cNvPr id="0" name="image11.png"/>
+                    <pic:cNvPr id="0" name="image9.png"/>
                     <pic:cNvPicPr preferRelativeResize="0"/>
                   </pic:nvPicPr>
                   <pic:blipFill>
@@ -4162,12 +3913,12 @@
           <wp:inline distB="114300" distT="114300" distL="114300" distR="114300">
             <wp:extent cx="5891213" cy="708078"/>
             <wp:effectExtent b="0" l="0" r="0" t="0"/>
-            <wp:docPr id="15" name="image13.png"/>
+            <wp:docPr id="15" name="image14.png"/>
             <a:graphic>
               <a:graphicData uri="http://schemas.openxmlformats.org/drawingml/2006/picture">
                 <pic:pic>
                   <pic:nvPicPr>
-                    <pic:cNvPr id="0" name="image13.png"/>
+                    <pic:cNvPr id="0" name="image14.png"/>
                     <pic:cNvPicPr preferRelativeResize="0"/>
                   </pic:nvPicPr>
                   <pic:blipFill>
@@ -4215,36 +3966,6 @@
         </w:rPr>
         <w:tab/>
         <w:t xml:space="preserve">Cluster 2 had higher mean and median total annual spending (44,883.68 and 35,222.50) than Cluster 1 (24,529.24 and 19,745.00). It also contained 75 high-spending customers (39.89% of the cluster), compared with 35 (13.89%) in Cluster 1. Average customer-level spending shares further distinguished the profiles: Cluster 1 focused primarily on Fresh (50.78%), while Cluster 2 allocated larger shares to Grocery (34.06%), Milk (23.38%), and Detergents_Paper (13.81%). These findings support prioritizing Cluster 2 for high-spending customer initiatives while tailoring promotions and loyalty benefits to each segment’s purchasing profile.</w:t>
-      </w:r>
-    </w:p>
-    <w:p>
-      <w:pPr>
-        <w:spacing w:after="240" w:before="240" w:line="480" w:lineRule="auto"/>
-        <w:rPr>
-          <w:rFonts w:ascii="Times New Roman" w:cs="Times New Roman" w:eastAsia="Times New Roman" w:hAnsi="Times New Roman"/>
-          <w:sz w:val="24"/>
-          <w:szCs w:val="24"/>
-        </w:rPr>
-      </w:pPr>
-      <w:r>
-        <w:rPr>
-          <w:rtl w:val="0"/>
-        </w:rPr>
-      </w:r>
-    </w:p>
-    <w:p>
-      <w:pPr>
-        <w:spacing w:after="240" w:before="240" w:line="480" w:lineRule="auto"/>
-        <w:rPr>
-          <w:rFonts w:ascii="Times New Roman" w:cs="Times New Roman" w:eastAsia="Times New Roman" w:hAnsi="Times New Roman"/>
-          <w:sz w:val="24"/>
-          <w:szCs w:val="24"/>
-        </w:rPr>
-      </w:pPr>
-      <w:r>
-        <w:rPr>
-          <w:rtl w:val="0"/>
-        </w:rPr>
       </w:r>
     </w:p>
     <w:p>
@@ -4827,6 +4548,7 @@
     <w:p>
       <w:pPr>
         <w:spacing w:after="240" w:before="240" w:line="480" w:lineRule="auto"/>
+        <w:ind w:firstLine="720"/>
         <w:rPr>
           <w:rFonts w:ascii="Times New Roman" w:cs="Times New Roman" w:eastAsia="Times New Roman" w:hAnsi="Times New Roman"/>
           <w:sz w:val="24"/>
@@ -4841,171 +4563,6 @@
           <w:rtl w:val="0"/>
         </w:rPr>
         <w:t xml:space="preserve">High-spending customers were defined as those spending at least 41,307.50 annually. These profiles provide descriptive evidence relevant to H1 and H2 and identify potential candidates for the programme proposed in H3. The hypotheses were not formally tested. The silhouette score of 0.29 indicates some overlap between segments; effects on spending and loyalty and interest in programme participation remain to be evaluated.</w:t>
-      </w:r>
-    </w:p>
-    <w:p>
-      <w:pPr>
-        <w:spacing w:after="240" w:before="240" w:line="480" w:lineRule="auto"/>
-        <w:rPr>
-          <w:rFonts w:ascii="Times New Roman" w:cs="Times New Roman" w:eastAsia="Times New Roman" w:hAnsi="Times New Roman"/>
-          <w:sz w:val="24"/>
-          <w:szCs w:val="24"/>
-        </w:rPr>
-      </w:pPr>
-      <w:r>
-        <w:rPr>
-          <w:rtl w:val="0"/>
-        </w:rPr>
-      </w:r>
-    </w:p>
-    <w:p>
-      <w:pPr>
-        <w:spacing w:after="240" w:before="240" w:line="480" w:lineRule="auto"/>
-        <w:rPr>
-          <w:rFonts w:ascii="Times New Roman" w:cs="Times New Roman" w:eastAsia="Times New Roman" w:hAnsi="Times New Roman"/>
-          <w:sz w:val="24"/>
-          <w:szCs w:val="24"/>
-        </w:rPr>
-      </w:pPr>
-      <w:r>
-        <w:rPr>
-          <w:rtl w:val="0"/>
-        </w:rPr>
-      </w:r>
-    </w:p>
-    <w:p>
-      <w:pPr>
-        <w:spacing w:after="240" w:before="240" w:line="480" w:lineRule="auto"/>
-        <w:rPr>
-          <w:rFonts w:ascii="Times New Roman" w:cs="Times New Roman" w:eastAsia="Times New Roman" w:hAnsi="Times New Roman"/>
-          <w:sz w:val="24"/>
-          <w:szCs w:val="24"/>
-        </w:rPr>
-      </w:pPr>
-      <w:r>
-        <w:rPr>
-          <w:rtl w:val="0"/>
-        </w:rPr>
-      </w:r>
-    </w:p>
-    <w:p>
-      <w:pPr>
-        <w:spacing w:after="240" w:before="240" w:line="480" w:lineRule="auto"/>
-        <w:rPr>
-          <w:rFonts w:ascii="Times New Roman" w:cs="Times New Roman" w:eastAsia="Times New Roman" w:hAnsi="Times New Roman"/>
-          <w:sz w:val="24"/>
-          <w:szCs w:val="24"/>
-        </w:rPr>
-      </w:pPr>
-      <w:r>
-        <w:rPr>
-          <w:rtl w:val="0"/>
-        </w:rPr>
-      </w:r>
-    </w:p>
-    <w:p>
-      <w:pPr>
-        <w:spacing w:after="240" w:before="240" w:line="480" w:lineRule="auto"/>
-        <w:rPr>
-          <w:rFonts w:ascii="Times New Roman" w:cs="Times New Roman" w:eastAsia="Times New Roman" w:hAnsi="Times New Roman"/>
-          <w:sz w:val="24"/>
-          <w:szCs w:val="24"/>
-        </w:rPr>
-      </w:pPr>
-      <w:r>
-        <w:rPr>
-          <w:rtl w:val="0"/>
-        </w:rPr>
-      </w:r>
-    </w:p>
-    <w:p>
-      <w:pPr>
-        <w:spacing w:after="240" w:before="240" w:line="480" w:lineRule="auto"/>
-        <w:rPr>
-          <w:rFonts w:ascii="Times New Roman" w:cs="Times New Roman" w:eastAsia="Times New Roman" w:hAnsi="Times New Roman"/>
-          <w:sz w:val="24"/>
-          <w:szCs w:val="24"/>
-        </w:rPr>
-      </w:pPr>
-      <w:r>
-        <w:rPr>
-          <w:rtl w:val="0"/>
-        </w:rPr>
-      </w:r>
-    </w:p>
-    <w:p>
-      <w:pPr>
-        <w:spacing w:after="240" w:before="240" w:line="480" w:lineRule="auto"/>
-        <w:rPr>
-          <w:rFonts w:ascii="Times New Roman" w:cs="Times New Roman" w:eastAsia="Times New Roman" w:hAnsi="Times New Roman"/>
-          <w:sz w:val="24"/>
-          <w:szCs w:val="24"/>
-        </w:rPr>
-      </w:pPr>
-      <w:r>
-        <w:rPr>
-          <w:rtl w:val="0"/>
-        </w:rPr>
-      </w:r>
-    </w:p>
-    <w:p>
-      <w:pPr>
-        <w:spacing w:after="240" w:before="240" w:line="480" w:lineRule="auto"/>
-        <w:rPr>
-          <w:rFonts w:ascii="Times New Roman" w:cs="Times New Roman" w:eastAsia="Times New Roman" w:hAnsi="Times New Roman"/>
-          <w:sz w:val="24"/>
-          <w:szCs w:val="24"/>
-        </w:rPr>
-      </w:pPr>
-      <w:r>
-        <w:rPr>
-          <w:rtl w:val="0"/>
-        </w:rPr>
-      </w:r>
-    </w:p>
-    <w:p>
-      <w:pPr>
-        <w:spacing w:after="240" w:before="240" w:line="480" w:lineRule="auto"/>
-        <w:rPr>
-          <w:rFonts w:ascii="Times New Roman" w:cs="Times New Roman" w:eastAsia="Times New Roman" w:hAnsi="Times New Roman"/>
-          <w:sz w:val="24"/>
-          <w:szCs w:val="24"/>
-        </w:rPr>
-      </w:pPr>
-      <w:r>
-        <w:rPr>
-          <w:rtl w:val="0"/>
-        </w:rPr>
-      </w:r>
-    </w:p>
-    <w:p>
-      <w:pPr>
-        <w:spacing w:after="240" w:before="240" w:line="480" w:lineRule="auto"/>
-        <w:rPr>
-          <w:rFonts w:ascii="Times New Roman" w:cs="Times New Roman" w:eastAsia="Times New Roman" w:hAnsi="Times New Roman"/>
-          <w:sz w:val="24"/>
-          <w:szCs w:val="24"/>
-        </w:rPr>
-      </w:pPr>
-      <w:r>
-        <w:rPr>
-          <w:rtl w:val="0"/>
-        </w:rPr>
-      </w:r>
-    </w:p>
-    <w:p>
-      <w:pPr>
-        <w:spacing w:after="240" w:before="240" w:line="480" w:lineRule="auto"/>
-        <w:rPr>
-          <w:rFonts w:ascii="Times New Roman" w:cs="Times New Roman" w:eastAsia="Times New Roman" w:hAnsi="Times New Roman"/>
-          <w:sz w:val="24"/>
-          <w:szCs w:val="24"/>
-        </w:rPr>
-      </w:pPr>
-      <w:r>
-        <w:rPr>
-          <w:rtl w:val="0"/>
-        </w:rPr>
       </w:r>
     </w:p>
     <w:p>
@@ -5029,7 +4586,6 @@
         <w:spacing w:line="480" w:lineRule="auto"/>
         <w:ind w:firstLine="720"/>
         <w:rPr>
-          <w:rFonts w:ascii="Times New Roman" w:cs="Times New Roman" w:eastAsia="Times New Roman" w:hAnsi="Times New Roman"/>
           <w:sz w:val="24"/>
           <w:szCs w:val="24"/>
         </w:rPr>
@@ -5043,25 +4599,16 @@
         </w:rPr>
         <w:t xml:space="preserve">Two visualizations were used to communicate the segmentation results. The customer count chart compares segment sizes: Cluster 1 contains 252 customers (57.27%), while Cluster 2 contains 188 customers (42.73%). The purchasing profile chart compares standardized log spending across the six categories. Cluster 1 shows above-average spending on Fresh and Frozen, whereas Cluster 2 shows above-average spending on Milk, Grocery, Detergents_Paper, and Delicassen. Together, these charts illustrate the relative size and purchasing characteristics of each segment.</w:t>
       </w:r>
-    </w:p>
-    <w:p>
-      <w:pPr>
-        <w:spacing w:line="480" w:lineRule="auto"/>
-        <w:ind w:firstLine="720"/>
-        <w:rPr>
-          <w:sz w:val="24"/>
-          <w:szCs w:val="24"/>
-        </w:rPr>
-      </w:pPr>
-      <w:r>
-        <w:rPr>
-          <w:rtl w:val="0"/>
-        </w:rPr>
-      </w:r>
-    </w:p>
-    <w:p>
-      <w:pPr>
-        <w:spacing w:after="240" w:before="240" w:line="480" w:lineRule="auto"/>
+      <w:r>
+        <w:rPr>
+          <w:rtl w:val="0"/>
+        </w:rPr>
+      </w:r>
+    </w:p>
+    <w:p>
+      <w:pPr>
+        <w:spacing w:after="240" w:before="240" w:line="480" w:lineRule="auto"/>
+        <w:jc w:val="center"/>
         <w:rPr>
           <w:rFonts w:ascii="Times New Roman" w:cs="Times New Roman" w:eastAsia="Times New Roman" w:hAnsi="Times New Roman"/>
           <w:sz w:val="24"/>
@@ -5076,14 +4623,14 @@
         </w:rPr>
         <w:drawing>
           <wp:inline distB="114300" distT="114300" distL="114300" distR="114300">
-            <wp:extent cx="5943600" cy="3937000"/>
+            <wp:extent cx="4010025" cy="1906191"/>
             <wp:effectExtent b="0" l="0" r="0" t="0"/>
-            <wp:docPr id="11" name="image2.png"/>
+            <wp:docPr id="11" name="image19.png"/>
             <a:graphic>
               <a:graphicData uri="http://schemas.openxmlformats.org/drawingml/2006/picture">
                 <pic:pic>
                   <pic:nvPicPr>
-                    <pic:cNvPr id="0" name="image2.png"/>
+                    <pic:cNvPr id="0" name="image19.png"/>
                     <pic:cNvPicPr preferRelativeResize="0"/>
                   </pic:nvPicPr>
                   <pic:blipFill>
@@ -5096,7 +4643,7 @@
                   <pic:spPr>
                     <a:xfrm>
                       <a:off x="0" y="0"/>
-                      <a:ext cx="5943600" cy="3937000"/>
+                      <a:ext cx="4010025" cy="1906191"/>
                     </a:xfrm>
                     <a:prstGeom prst="rect"/>
                     <a:ln/>
@@ -5116,6 +4663,7 @@
     <w:p>
       <w:pPr>
         <w:spacing w:after="240" w:before="240" w:line="480" w:lineRule="auto"/>
+        <w:jc w:val="center"/>
         <w:rPr>
           <w:rFonts w:ascii="Times New Roman" w:cs="Times New Roman" w:eastAsia="Times New Roman" w:hAnsi="Times New Roman"/>
           <w:sz w:val="24"/>
@@ -5130,14 +4678,14 @@
         </w:rPr>
         <w:drawing>
           <wp:inline distB="114300" distT="114300" distL="114300" distR="114300">
-            <wp:extent cx="5943600" cy="3784600"/>
+            <wp:extent cx="4252913" cy="2442175"/>
             <wp:effectExtent b="0" l="0" r="0" t="0"/>
-            <wp:docPr id="17" name="image10.png"/>
+            <wp:docPr id="17" name="image4.png"/>
             <a:graphic>
               <a:graphicData uri="http://schemas.openxmlformats.org/drawingml/2006/picture">
                 <pic:pic>
                   <pic:nvPicPr>
-                    <pic:cNvPr id="0" name="image10.png"/>
+                    <pic:cNvPr id="0" name="image4.png"/>
                     <pic:cNvPicPr preferRelativeResize="0"/>
                   </pic:nvPicPr>
                   <pic:blipFill>
@@ -5150,7 +4698,7 @@
                   <pic:spPr>
                     <a:xfrm>
                       <a:off x="0" y="0"/>
-                      <a:ext cx="5943600" cy="3784600"/>
+                      <a:ext cx="4252913" cy="2442175"/>
                     </a:xfrm>
                     <a:prstGeom prst="rect"/>
                     <a:ln/>
@@ -5169,126 +4717,6 @@
     </w:p>
     <w:p>
       <w:pPr>
-        <w:spacing w:after="240" w:before="240" w:line="480" w:lineRule="auto"/>
-        <w:rPr>
-          <w:rFonts w:ascii="Times New Roman" w:cs="Times New Roman" w:eastAsia="Times New Roman" w:hAnsi="Times New Roman"/>
-          <w:sz w:val="24"/>
-          <w:szCs w:val="24"/>
-        </w:rPr>
-      </w:pPr>
-      <w:r>
-        <w:rPr>
-          <w:rtl w:val="0"/>
-        </w:rPr>
-      </w:r>
-    </w:p>
-    <w:p>
-      <w:pPr>
-        <w:spacing w:after="240" w:before="240" w:line="480" w:lineRule="auto"/>
-        <w:rPr>
-          <w:rFonts w:ascii="Times New Roman" w:cs="Times New Roman" w:eastAsia="Times New Roman" w:hAnsi="Times New Roman"/>
-          <w:sz w:val="24"/>
-          <w:szCs w:val="24"/>
-        </w:rPr>
-      </w:pPr>
-      <w:r>
-        <w:rPr>
-          <w:rtl w:val="0"/>
-        </w:rPr>
-      </w:r>
-    </w:p>
-    <w:p>
-      <w:pPr>
-        <w:spacing w:after="240" w:before="240" w:line="480" w:lineRule="auto"/>
-        <w:rPr>
-          <w:rFonts w:ascii="Times New Roman" w:cs="Times New Roman" w:eastAsia="Times New Roman" w:hAnsi="Times New Roman"/>
-          <w:sz w:val="24"/>
-          <w:szCs w:val="24"/>
-        </w:rPr>
-      </w:pPr>
-      <w:r>
-        <w:rPr>
-          <w:rtl w:val="0"/>
-        </w:rPr>
-      </w:r>
-    </w:p>
-    <w:p>
-      <w:pPr>
-        <w:spacing w:after="240" w:before="240" w:line="480" w:lineRule="auto"/>
-        <w:rPr>
-          <w:rFonts w:ascii="Times New Roman" w:cs="Times New Roman" w:eastAsia="Times New Roman" w:hAnsi="Times New Roman"/>
-          <w:sz w:val="24"/>
-          <w:szCs w:val="24"/>
-        </w:rPr>
-      </w:pPr>
-      <w:r>
-        <w:rPr>
-          <w:rtl w:val="0"/>
-        </w:rPr>
-      </w:r>
-    </w:p>
-    <w:p>
-      <w:pPr>
-        <w:spacing w:after="240" w:before="240" w:line="480" w:lineRule="auto"/>
-        <w:rPr>
-          <w:rFonts w:ascii="Times New Roman" w:cs="Times New Roman" w:eastAsia="Times New Roman" w:hAnsi="Times New Roman"/>
-          <w:sz w:val="24"/>
-          <w:szCs w:val="24"/>
-        </w:rPr>
-      </w:pPr>
-      <w:r>
-        <w:rPr>
-          <w:rtl w:val="0"/>
-        </w:rPr>
-      </w:r>
-    </w:p>
-    <w:p>
-      <w:pPr>
-        <w:spacing w:after="240" w:before="240" w:line="480" w:lineRule="auto"/>
-        <w:rPr>
-          <w:rFonts w:ascii="Times New Roman" w:cs="Times New Roman" w:eastAsia="Times New Roman" w:hAnsi="Times New Roman"/>
-          <w:sz w:val="24"/>
-          <w:szCs w:val="24"/>
-        </w:rPr>
-      </w:pPr>
-      <w:r>
-        <w:rPr>
-          <w:rtl w:val="0"/>
-        </w:rPr>
-      </w:r>
-    </w:p>
-    <w:p>
-      <w:pPr>
-        <w:spacing w:after="240" w:before="240" w:line="480" w:lineRule="auto"/>
-        <w:rPr>
-          <w:rFonts w:ascii="Times New Roman" w:cs="Times New Roman" w:eastAsia="Times New Roman" w:hAnsi="Times New Roman"/>
-          <w:sz w:val="24"/>
-          <w:szCs w:val="24"/>
-        </w:rPr>
-      </w:pPr>
-      <w:r>
-        <w:rPr>
-          <w:rtl w:val="0"/>
-        </w:rPr>
-      </w:r>
-    </w:p>
-    <w:p>
-      <w:pPr>
-        <w:spacing w:after="240" w:before="240" w:line="480" w:lineRule="auto"/>
-        <w:rPr>
-          <w:rFonts w:ascii="Times New Roman" w:cs="Times New Roman" w:eastAsia="Times New Roman" w:hAnsi="Times New Roman"/>
-          <w:sz w:val="24"/>
-          <w:szCs w:val="24"/>
-        </w:rPr>
-      </w:pPr>
-      <w:r>
-        <w:rPr>
-          <w:rtl w:val="0"/>
-        </w:rPr>
-      </w:r>
-    </w:p>
-    <w:p>
-      <w:pPr>
         <w:pStyle w:val="Heading1"/>
         <w:spacing w:after="240" w:before="240" w:line="480" w:lineRule="auto"/>
         <w:jc w:val="center"/>
@@ -5306,6 +4734,7 @@
     <w:p>
       <w:pPr>
         <w:spacing w:after="240" w:before="240" w:line="480" w:lineRule="auto"/>
+        <w:ind w:firstLine="720"/>
         <w:rPr>
           <w:rFonts w:ascii="Times New Roman" w:cs="Times New Roman" w:eastAsia="Times New Roman" w:hAnsi="Times New Roman"/>
           <w:sz w:val="24"/>
@@ -5841,56 +5270,6 @@
     </w:tbl>
     <w:p>
       <w:pPr>
-        <w:pStyle w:val="Heading1"/>
-        <w:spacing w:after="240" w:before="240" w:line="480" w:lineRule="auto"/>
-        <w:jc w:val="center"/>
-        <w:rPr/>
-      </w:pPr>
-      <w:bookmarkStart w:colFirst="0" w:colLast="0" w:name="_1irb6mbacaqb" w:id="11"/>
-      <w:bookmarkEnd w:id="11"/>
-      <w:r>
-        <w:rPr>
-          <w:rtl w:val="0"/>
-        </w:rPr>
-      </w:r>
-    </w:p>
-    <w:p>
-      <w:pPr>
-        <w:pStyle w:val="Heading1"/>
-        <w:spacing w:after="240" w:before="240" w:line="480" w:lineRule="auto"/>
-        <w:jc w:val="center"/>
-        <w:rPr/>
-      </w:pPr>
-      <w:bookmarkStart w:colFirst="0" w:colLast="0" w:name="_xcjbu8ho7vy4" w:id="12"/>
-      <w:bookmarkEnd w:id="12"/>
-      <w:r>
-        <w:rPr>
-          <w:rtl w:val="0"/>
-        </w:rPr>
-      </w:r>
-    </w:p>
-    <w:p>
-      <w:pPr>
-        <w:rPr/>
-      </w:pPr>
-      <w:r>
-        <w:rPr>
-          <w:rtl w:val="0"/>
-        </w:rPr>
-      </w:r>
-    </w:p>
-    <w:p>
-      <w:pPr>
-        <w:rPr/>
-      </w:pPr>
-      <w:r>
-        <w:rPr>
-          <w:rtl w:val="0"/>
-        </w:rPr>
-      </w:r>
-    </w:p>
-    <w:p>
-      <w:pPr>
         <w:rPr/>
       </w:pPr>
       <w:r>
@@ -5912,8 +5291,8 @@
           <w:szCs w:val="26"/>
         </w:rPr>
       </w:pPr>
-      <w:bookmarkStart w:colFirst="0" w:colLast="0" w:name="_h49evb3c423a" w:id="13"/>
-      <w:bookmarkEnd w:id="13"/>
+      <w:bookmarkStart w:colFirst="0" w:colLast="0" w:name="_h49evb3c423a" w:id="11"/>
+      <w:bookmarkEnd w:id="11"/>
       <w:r>
         <w:rPr>
           <w:rtl w:val="0"/>
@@ -5930,67 +5309,380 @@
       <w:pPr>
         <w:spacing w:after="240" w:before="240" w:line="480" w:lineRule="auto"/>
         <w:ind w:firstLine="720"/>
+        <w:rPr>
+          <w:rFonts w:ascii="Times New Roman" w:cs="Times New Roman" w:eastAsia="Times New Roman" w:hAnsi="Times New Roman"/>
+          <w:sz w:val="24"/>
+          <w:szCs w:val="24"/>
+        </w:rPr>
+      </w:pPr>
+      <w:r>
+        <w:rPr>
+          <w:rFonts w:ascii="Times New Roman" w:cs="Times New Roman" w:eastAsia="Times New Roman" w:hAnsi="Times New Roman"/>
+          <w:sz w:val="24"/>
+          <w:szCs w:val="24"/>
+          <w:rtl w:val="0"/>
+        </w:rPr>
+        <w:t xml:space="preserve">A supermarket pilot could test a loyalty programme and personalized messages using the supermarket's own customer data. A checkout system or shopping application could support voluntary email registration and, where there is a clear purpose, a customer-reported age range. Age should not be inferred from appearance. Promotional communications should require explicit consent and offer an unsubscribe option. Only necessary data should be collected, access should be restricted, and identifiable information should be retained only as long as needed for its stated purpose.</w:t>
+      </w:r>
+    </w:p>
+    <w:p>
+      <w:pPr>
+        <w:spacing w:after="240" w:before="240" w:line="480" w:lineRule="auto"/>
+        <w:ind w:firstLine="720"/>
+        <w:rPr>
+          <w:rFonts w:ascii="Times New Roman" w:cs="Times New Roman" w:eastAsia="Times New Roman" w:hAnsi="Times New Roman"/>
+          <w:sz w:val="24"/>
+          <w:szCs w:val="24"/>
+        </w:rPr>
+      </w:pPr>
+      <w:r>
+        <w:rPr>
+          <w:rFonts w:ascii="Times New Roman" w:cs="Times New Roman" w:eastAsia="Times New Roman" w:hAnsi="Times New Roman"/>
+          <w:sz w:val="24"/>
+          <w:szCs w:val="24"/>
+          <w:rtl w:val="0"/>
+        </w:rPr>
+        <w:t xml:space="preserve">A partnership with a financial startup could explore a card usable at other retailers while offering special discounts at the supermarket. This proposal requires a separate assessment of feasibility, costs, and credit conditions. Spending clusters should not determine credit approval or credit limits. Any sharing of identifiable customer information with the partner should be transparent and subject to appropriate authorization.</w:t>
+      </w:r>
+    </w:p>
+    <w:p>
+      <w:pPr>
+        <w:spacing w:after="240" w:before="240" w:line="480" w:lineRule="auto"/>
+        <w:ind w:firstLine="720"/>
+        <w:rPr>
+          <w:rFonts w:ascii="Times New Roman" w:cs="Times New Roman" w:eastAsia="Times New Roman" w:hAnsi="Times New Roman"/>
+          <w:sz w:val="24"/>
+          <w:szCs w:val="24"/>
+        </w:rPr>
+      </w:pPr>
+      <w:r>
+        <w:rPr>
+          <w:rFonts w:ascii="Times New Roman" w:cs="Times New Roman" w:eastAsia="Times New Roman" w:hAnsi="Times New Roman"/>
+          <w:sz w:val="24"/>
+          <w:szCs w:val="24"/>
+          <w:rtl w:val="0"/>
+        </w:rPr>
+        <w:t xml:space="preserve">Segments describe average tendencies, not identical individuals. Customers within the same segment may have different needs, budgets, and preferences, and these may change over time. Marketers should therefore allow individual choices, update profiles when appropriate, respect privacy, and avoid using segment labels to exclude or pressure customers. The pilot should compare outcomes with a control group and evaluate incremental revenue, profit, repeat purchases, and customer feedback before expansion.</w:t>
+      </w:r>
+    </w:p>
+    <w:p>
+      <w:pPr>
         <w:rPr/>
       </w:pPr>
       <w:r>
         <w:rPr>
           <w:rtl w:val="0"/>
         </w:rPr>
-        <w:t xml:space="preserve">A </w:t>
-      </w:r>
-      <w:r>
-        <w:rPr>
-          <w:b w:val="1"/>
-          <w:bCs w:val="1"/>
-          <w:rtl w:val="0"/>
-        </w:rPr>
-        <w:t xml:space="preserve">supermarket pilot</w:t>
-      </w:r>
-      <w:r>
-        <w:rPr>
-          <w:rtl w:val="0"/>
-        </w:rPr>
-        <w:t xml:space="preserve"> could test a loyalty programme and personalized messages using the supermarket's own customer data. A checkout system or shopping application could support voluntary email registration and, where there is a clear purpose, a customer-reported age range. Age should not be inferred from appearance. Promotional communications should require explicit consent and offer an unsubscribe option. Only necessary data should be collected, access should be restricted, and identifiable information should be retained only as long as needed for its stated purpose.</w:t>
-      </w:r>
-    </w:p>
-    <w:p>
-      <w:pPr>
-        <w:spacing w:after="240" w:before="240" w:line="480" w:lineRule="auto"/>
-        <w:ind w:firstLine="720"/>
+      </w:r>
+    </w:p>
+    <w:p>
+      <w:pPr>
         <w:rPr/>
       </w:pPr>
       <w:r>
         <w:rPr>
           <w:rtl w:val="0"/>
         </w:rPr>
-        <w:t xml:space="preserve">A partnership with a financial startup could explore a card usable at other retailers while offering special discounts at the supermarket. This proposal requires a separate assessment of feasibility, costs, and credit conditions. </w:t>
-      </w:r>
-      <w:r>
-        <w:rPr>
-          <w:b w:val="1"/>
-          <w:bCs w:val="1"/>
-          <w:rtl w:val="0"/>
-        </w:rPr>
-        <w:t xml:space="preserve">Spending clusters should not determine credit approval or credit limits.</w:t>
-      </w:r>
-      <w:r>
-        <w:rPr>
-          <w:rtl w:val="0"/>
-        </w:rPr>
-        <w:t xml:space="preserve"> Any sharing of identifiable customer information with the partner should be transparent and subject to appropriate authorization.</w:t>
-      </w:r>
-    </w:p>
-    <w:p>
-      <w:pPr>
-        <w:spacing w:after="240" w:before="240" w:line="480" w:lineRule="auto"/>
-        <w:ind w:firstLine="720"/>
+      </w:r>
+    </w:p>
+    <w:p>
+      <w:pPr>
         <w:rPr/>
       </w:pPr>
       <w:r>
         <w:rPr>
           <w:rtl w:val="0"/>
         </w:rPr>
-        <w:t xml:space="preserve">Segments describe average tendencies, not identical individuals. Customers within the same segment may have different needs, budgets, and preferences, and these may change over time. Marketers should therefore allow individual choices, update profiles when appropriate, respect privacy, and avoid using segment labels to exclude or pressure customers. The pilot should compare outcomes with a control group and evaluate incremental revenue, profit, repeat purchases, and customer feedback before expansion.</w:t>
+      </w:r>
+    </w:p>
+    <w:p>
+      <w:pPr>
+        <w:rPr/>
+      </w:pPr>
+      <w:r>
+        <w:rPr>
+          <w:rtl w:val="0"/>
+        </w:rPr>
+      </w:r>
+    </w:p>
+    <w:p>
+      <w:pPr>
+        <w:rPr/>
+      </w:pPr>
+      <w:r>
+        <w:rPr>
+          <w:rtl w:val="0"/>
+        </w:rPr>
+      </w:r>
+    </w:p>
+    <w:p>
+      <w:pPr>
+        <w:rPr/>
+      </w:pPr>
+      <w:r>
+        <w:rPr>
+          <w:rtl w:val="0"/>
+        </w:rPr>
+      </w:r>
+    </w:p>
+    <w:p>
+      <w:pPr>
+        <w:rPr/>
+      </w:pPr>
+      <w:r>
+        <w:rPr>
+          <w:rtl w:val="0"/>
+        </w:rPr>
+      </w:r>
+    </w:p>
+    <w:p>
+      <w:pPr>
+        <w:rPr/>
+      </w:pPr>
+      <w:r>
+        <w:rPr>
+          <w:rtl w:val="0"/>
+        </w:rPr>
+      </w:r>
+    </w:p>
+    <w:p>
+      <w:pPr>
+        <w:rPr/>
+      </w:pPr>
+      <w:r>
+        <w:rPr>
+          <w:rtl w:val="0"/>
+        </w:rPr>
+      </w:r>
+    </w:p>
+    <w:p>
+      <w:pPr>
+        <w:rPr/>
+      </w:pPr>
+      <w:r>
+        <w:rPr>
+          <w:rtl w:val="0"/>
+        </w:rPr>
+      </w:r>
+    </w:p>
+    <w:p>
+      <w:pPr>
+        <w:rPr/>
+      </w:pPr>
+      <w:r>
+        <w:rPr>
+          <w:rtl w:val="0"/>
+        </w:rPr>
+      </w:r>
+    </w:p>
+    <w:p>
+      <w:pPr>
+        <w:rPr/>
+      </w:pPr>
+      <w:r>
+        <w:rPr>
+          <w:rtl w:val="0"/>
+        </w:rPr>
+      </w:r>
+    </w:p>
+    <w:p>
+      <w:pPr>
+        <w:rPr/>
+      </w:pPr>
+      <w:r>
+        <w:rPr>
+          <w:rtl w:val="0"/>
+        </w:rPr>
+      </w:r>
+    </w:p>
+    <w:p>
+      <w:pPr>
+        <w:rPr/>
+      </w:pPr>
+      <w:r>
+        <w:rPr>
+          <w:rtl w:val="0"/>
+        </w:rPr>
+      </w:r>
+    </w:p>
+    <w:p>
+      <w:pPr>
+        <w:rPr/>
+      </w:pPr>
+      <w:r>
+        <w:rPr>
+          <w:rtl w:val="0"/>
+        </w:rPr>
+      </w:r>
+    </w:p>
+    <w:p>
+      <w:pPr>
+        <w:rPr/>
+      </w:pPr>
+      <w:r>
+        <w:rPr>
+          <w:rtl w:val="0"/>
+        </w:rPr>
+      </w:r>
+    </w:p>
+    <w:p>
+      <w:pPr>
+        <w:rPr/>
+      </w:pPr>
+      <w:r>
+        <w:rPr>
+          <w:rtl w:val="0"/>
+        </w:rPr>
+      </w:r>
+    </w:p>
+    <w:p>
+      <w:pPr>
+        <w:rPr/>
+      </w:pPr>
+      <w:r>
+        <w:rPr>
+          <w:rtl w:val="0"/>
+        </w:rPr>
+      </w:r>
+    </w:p>
+    <w:p>
+      <w:pPr>
+        <w:rPr/>
+      </w:pPr>
+      <w:r>
+        <w:rPr>
+          <w:rtl w:val="0"/>
+        </w:rPr>
+      </w:r>
+    </w:p>
+    <w:p>
+      <w:pPr>
+        <w:rPr/>
+      </w:pPr>
+      <w:r>
+        <w:rPr>
+          <w:rtl w:val="0"/>
+        </w:rPr>
+      </w:r>
+    </w:p>
+    <w:p>
+      <w:pPr>
+        <w:rPr/>
+      </w:pPr>
+      <w:r>
+        <w:rPr>
+          <w:rtl w:val="0"/>
+        </w:rPr>
+      </w:r>
+    </w:p>
+    <w:p>
+      <w:pPr>
+        <w:rPr/>
+      </w:pPr>
+      <w:r>
+        <w:rPr>
+          <w:rtl w:val="0"/>
+        </w:rPr>
+      </w:r>
+    </w:p>
+    <w:p>
+      <w:pPr>
+        <w:rPr/>
+      </w:pPr>
+      <w:r>
+        <w:rPr>
+          <w:rtl w:val="0"/>
+        </w:rPr>
+      </w:r>
+    </w:p>
+    <w:p>
+      <w:pPr>
+        <w:rPr/>
+      </w:pPr>
+      <w:r>
+        <w:rPr>
+          <w:rtl w:val="0"/>
+        </w:rPr>
+      </w:r>
+    </w:p>
+    <w:p>
+      <w:pPr>
+        <w:rPr/>
+      </w:pPr>
+      <w:r>
+        <w:rPr>
+          <w:rtl w:val="0"/>
+        </w:rPr>
+      </w:r>
+    </w:p>
+    <w:p>
+      <w:pPr>
+        <w:rPr/>
+      </w:pPr>
+      <w:r>
+        <w:rPr>
+          <w:rtl w:val="0"/>
+        </w:rPr>
+      </w:r>
+    </w:p>
+    <w:p>
+      <w:pPr>
+        <w:rPr/>
+      </w:pPr>
+      <w:r>
+        <w:rPr>
+          <w:rtl w:val="0"/>
+        </w:rPr>
+      </w:r>
+    </w:p>
+    <w:p>
+      <w:pPr>
+        <w:rPr/>
+      </w:pPr>
+      <w:r>
+        <w:rPr>
+          <w:rtl w:val="0"/>
+        </w:rPr>
+      </w:r>
+    </w:p>
+    <w:p>
+      <w:pPr>
+        <w:rPr/>
+      </w:pPr>
+      <w:r>
+        <w:rPr>
+          <w:rtl w:val="0"/>
+        </w:rPr>
+      </w:r>
+    </w:p>
+    <w:p>
+      <w:pPr>
+        <w:rPr/>
+      </w:pPr>
+      <w:r>
+        <w:rPr>
+          <w:rtl w:val="0"/>
+        </w:rPr>
+      </w:r>
+    </w:p>
+    <w:p>
+      <w:pPr>
+        <w:rPr/>
+      </w:pPr>
+      <w:r>
+        <w:rPr>
+          <w:rtl w:val="0"/>
+        </w:rPr>
+      </w:r>
+    </w:p>
+    <w:p>
+      <w:pPr>
+        <w:rPr/>
+      </w:pPr>
+      <w:r>
+        <w:rPr>
+          <w:rtl w:val="0"/>
+        </w:rPr>
       </w:r>
     </w:p>
     <w:p>
@@ -6020,8 +5712,8 @@
         <w:jc w:val="center"/>
         <w:rPr/>
       </w:pPr>
-      <w:bookmarkStart w:colFirst="0" w:colLast="0" w:name="_8movtjtinzaz" w:id="14"/>
-      <w:bookmarkEnd w:id="14"/>
+      <w:bookmarkStart w:colFirst="0" w:colLast="0" w:name="_8movtjtinzaz" w:id="12"/>
+      <w:bookmarkEnd w:id="12"/>
       <w:r>
         <w:rPr>
           <w:rtl w:val="0"/>
@@ -6279,10 +5971,8 @@
         <w:ind w:left="720"/>
         <w:rPr>
           <w:rFonts w:ascii="Times New Roman" w:cs="Times New Roman" w:eastAsia="Times New Roman" w:hAnsi="Times New Roman"/>
-          <w:color w:val="1155cc"/>
-          <w:sz w:val="24"/>
-          <w:szCs w:val="24"/>
-          <w:u w:val="single"/>
+          <w:sz w:val="24"/>
+          <w:szCs w:val="24"/>
         </w:rPr>
       </w:pPr>
       <w:r>
@@ -6320,22 +6010,6 @@
           <w:t xml:space="preserve">https://doi.org/10.1007/978-1-0716-1418-1</w:t>
         </w:r>
       </w:hyperlink>
-      <w:r>
-        <w:rPr>
-          <w:rtl w:val="0"/>
-        </w:rPr>
-      </w:r>
-    </w:p>
-    <w:p>
-      <w:pPr>
-        <w:spacing w:before="120" w:line="480" w:lineRule="auto"/>
-        <w:ind w:left="720"/>
-        <w:rPr>
-          <w:rFonts w:ascii="Times New Roman" w:cs="Times New Roman" w:eastAsia="Times New Roman" w:hAnsi="Times New Roman"/>
-          <w:sz w:val="24"/>
-          <w:szCs w:val="24"/>
-        </w:rPr>
-      </w:pPr>
       <w:r>
         <w:rPr>
           <w:rtl w:val="0"/>

</xml_diff>